<commit_message>
mejoro el proceso de generador
</commit_message>
<xml_diff>
--- a/Formatos_Cruce/cambio de nombre inefectivo.docx
+++ b/Formatos_Cruce/cambio de nombre inefectivo.docx
@@ -13,8 +13,6 @@
           <w:lang w:val="es-CO" w:eastAsia="en-US"/>
         </w:rPr>
       </w:pPr>
-      <w:bookmarkStart w:id="0" w:name="_GoBack"/>
-      <w:bookmarkEnd w:id="0"/>
       <w:r>
         <w:rPr>
           <w:rFonts w:ascii="Arial" w:eastAsia="Calibri" w:hAnsi="Arial" w:cs="Arial"/>
@@ -959,23 +957,7 @@
           <w:b/>
           <w:noProof/>
         </w:rPr>
-        <w:t>{{</w:t>
-      </w:r>
-      <w:r>
-        <w:rPr>
-          <w:rFonts w:ascii="Arial" w:hAnsi="Arial" w:cs="Arial"/>
-          <w:b/>
-          <w:noProof/>
-        </w:rPr>
-        <w:t>nombre</w:t>
-      </w:r>
-      <w:r>
-        <w:rPr>
-          <w:rFonts w:ascii="Arial" w:hAnsi="Arial" w:cs="Arial"/>
-          <w:b/>
-          <w:noProof/>
-        </w:rPr>
-        <w:t>}}</w:t>
+        <w:t>{{nombre}}</w:t>
       </w:r>
       <w:r>
         <w:rPr>
@@ -1384,10 +1366,10 @@
           <w:lang w:val="es-CO" w:eastAsia="es-CO"/>
         </w:rPr>
       </w:pPr>
-      <w:bookmarkStart w:id="1" w:name="_Hlk124083949"/>
-      <w:bookmarkStart w:id="2" w:name="_Hlk117529920"/>
-      <w:bookmarkStart w:id="3" w:name="_Hlk108018288"/>
-      <w:bookmarkStart w:id="4" w:name="_Hlk101462265"/>
+      <w:bookmarkStart w:id="0" w:name="_Hlk124083949"/>
+      <w:bookmarkStart w:id="1" w:name="_Hlk117529920"/>
+      <w:bookmarkStart w:id="2" w:name="_Hlk108018288"/>
+      <w:bookmarkStart w:id="3" w:name="_Hlk101462265"/>
     </w:p>
     <w:p>
       <w:pPr>
@@ -1404,17 +1386,17 @@
         </w:rPr>
         <w:t xml:space="preserve">RESOLVER </w:t>
       </w:r>
-      <w:bookmarkStart w:id="5" w:name="_Hlk125988342"/>
+      <w:bookmarkStart w:id="4" w:name="_Hlk125988342"/>
       <w:r>
         <w:rPr>
           <w:rFonts w:ascii="Arial" w:hAnsi="Arial" w:cs="Arial"/>
         </w:rPr>
         <w:t>cada una de las inquietudes presentadas, de acuerdo con lo expuesto en la parte motiva del presente acto administrativo.</w:t>
       </w:r>
-      <w:bookmarkEnd w:id="1"/>
-      <w:bookmarkEnd w:id="5"/>
+      <w:bookmarkEnd w:id="0"/>
+      <w:bookmarkEnd w:id="4"/>
     </w:p>
-    <w:bookmarkEnd w:id="2"/>
+    <w:bookmarkEnd w:id="1"/>
     <w:p>
       <w:pPr>
         <w:jc w:val="both"/>
@@ -1436,10 +1418,10 @@
           <w:lang w:val="es-CO" w:eastAsia="en-US"/>
         </w:rPr>
       </w:pPr>
-      <w:bookmarkStart w:id="6" w:name="_Hlk170132818"/>
-      <w:bookmarkStart w:id="7" w:name="_Hlk106184349"/>
+      <w:bookmarkStart w:id="5" w:name="_Hlk170132818"/>
+      <w:bookmarkStart w:id="6" w:name="_Hlk106184349"/>
+      <w:bookmarkEnd w:id="2"/>
       <w:bookmarkEnd w:id="3"/>
-      <w:bookmarkEnd w:id="4"/>
       <w:r>
         <w:rPr>
           <w:rFonts w:ascii="Arial" w:eastAsia="Calibri" w:hAnsi="Arial" w:cs="Arial"/>
@@ -1508,6 +1490,17 @@
         </w:rPr>
         <w:fldChar w:fldCharType="end"/>
       </w:r>
+      <w:r>
+        <w:rPr>
+          <w:rFonts w:ascii="Arial" w:eastAsia="Calibri" w:hAnsi="Arial" w:cs="Arial"/>
+          <w:b/>
+          <w:bCs/>
+          <w:lang w:val="es-CO" w:eastAsia="en-US"/>
+        </w:rPr>
+        <w:t>}}</w:t>
+      </w:r>
+      <w:bookmarkStart w:id="7" w:name="_GoBack"/>
+      <w:bookmarkEnd w:id="7"/>
       <w:r>
         <w:rPr>
           <w:rFonts w:ascii="Arial" w:eastAsia="Calibri" w:hAnsi="Arial" w:cs="Arial"/>
@@ -2056,8 +2049,8 @@
         </w:rPr>
         <w:t xml:space="preserve"> . En caso de no surtirse la notificación personal, procédase a la notificación por aviso, de conformidad con lo dispuesto en el artículo 69 de la Ley 1437 de 2011.</w:t>
       </w:r>
+      <w:bookmarkEnd w:id="5"/>
       <w:bookmarkEnd w:id="6"/>
-      <w:bookmarkEnd w:id="7"/>
     </w:p>
     <w:p>
       <w:pPr>
@@ -2895,21 +2888,21 @@
         <v:path o:extrusionok="f" gradientshapeok="t" o:connecttype="rect"/>
         <o:lock v:ext="edit" aspectratio="t"/>
       </v:shapetype>
-      <v:shape id="_x0000_i1029" type="#_x0000_t75" style="width:12.75pt;height:12.75pt" o:bullet="t">
+      <v:shape id="_x0000_i1043" type="#_x0000_t75" style="width:12.75pt;height:12.75pt" o:bullet="t">
         <v:imagedata r:id="rId1" o:title="mso2D3D"/>
       </v:shape>
     </w:pict>
   </w:numPicBullet>
   <w:numPicBullet w:numPicBulletId="1">
     <w:pict>
-      <v:shape id="_x0000_i1030" type="#_x0000_t75" style="width:12.75pt;height:12.75pt" o:bullet="t">
+      <v:shape id="_x0000_i1044" type="#_x0000_t75" style="width:12.75pt;height:12.75pt" o:bullet="t">
         <v:imagedata r:id="rId2" o:title="msoCA65"/>
       </v:shape>
     </w:pict>
   </w:numPicBullet>
   <w:numPicBullet w:numPicBulletId="2">
     <w:pict>
-      <v:shape id="_x0000_i1031" type="#_x0000_t75" style="width:69pt;height:54pt" o:bullet="t">
+      <v:shape id="_x0000_i1045" type="#_x0000_t75" style="width:69pt;height:54pt" o:bullet="t">
         <v:imagedata r:id="rId3" o:title="clip_image002"/>
       </v:shape>
     </w:pict>
@@ -9501,7 +9494,7 @@
 </file>
 
 <file path=customXml/itemProps1.xml><?xml version="1.0" encoding="utf-8"?>
-<ds:datastoreItem xmlns:ds="http://schemas.openxmlformats.org/officeDocument/2006/customXml" ds:itemID="{D8EA318B-1FD5-4089-AF7C-4C6E40617DF6}">
+<ds:datastoreItem xmlns:ds="http://schemas.openxmlformats.org/officeDocument/2006/customXml" ds:itemID="{147E18D3-8BFF-4652-90EB-3725BA44E77A}">
   <ds:schemaRefs>
     <ds:schemaRef ds:uri="http://schemas.openxmlformats.org/officeDocument/2006/bibliography"/>
   </ds:schemaRefs>

</xml_diff>

<commit_message>
aplicativo y generador hasta el momento estan bien
</commit_message>
<xml_diff>
--- a/Formatos_Cruce/cambio de nombre inefectivo.docx
+++ b/Formatos_Cruce/cambio de nombre inefectivo.docx
@@ -134,13 +134,8 @@
         </w:rPr>
         <w:t>}}</w:t>
       </w:r>
-      <w:r>
-        <w:rPr>
-          <w:rFonts w:ascii="Arial" w:eastAsia="Calibri" w:hAnsi="Arial" w:cs="Arial"/>
-          <w:lang w:val="es-CO" w:eastAsia="en-US"/>
-        </w:rPr>
-        <w:t>;</w:t>
-      </w:r>
+      <w:bookmarkStart w:id="0" w:name="_GoBack"/>
+      <w:bookmarkEnd w:id="0"/>
     </w:p>
     <w:p>
       <w:pPr>
@@ -1366,10 +1361,10 @@
           <w:lang w:val="es-CO" w:eastAsia="es-CO"/>
         </w:rPr>
       </w:pPr>
-      <w:bookmarkStart w:id="0" w:name="_Hlk124083949"/>
-      <w:bookmarkStart w:id="1" w:name="_Hlk117529920"/>
-      <w:bookmarkStart w:id="2" w:name="_Hlk108018288"/>
-      <w:bookmarkStart w:id="3" w:name="_Hlk101462265"/>
+      <w:bookmarkStart w:id="1" w:name="_Hlk124083949"/>
+      <w:bookmarkStart w:id="2" w:name="_Hlk117529920"/>
+      <w:bookmarkStart w:id="3" w:name="_Hlk108018288"/>
+      <w:bookmarkStart w:id="4" w:name="_Hlk101462265"/>
     </w:p>
     <w:p>
       <w:pPr>
@@ -1386,17 +1381,17 @@
         </w:rPr>
         <w:t xml:space="preserve">RESOLVER </w:t>
       </w:r>
-      <w:bookmarkStart w:id="4" w:name="_Hlk125988342"/>
+      <w:bookmarkStart w:id="5" w:name="_Hlk125988342"/>
       <w:r>
         <w:rPr>
           <w:rFonts w:ascii="Arial" w:hAnsi="Arial" w:cs="Arial"/>
         </w:rPr>
         <w:t>cada una de las inquietudes presentadas, de acuerdo con lo expuesto en la parte motiva del presente acto administrativo.</w:t>
       </w:r>
-      <w:bookmarkEnd w:id="0"/>
-      <w:bookmarkEnd w:id="4"/>
+      <w:bookmarkEnd w:id="1"/>
+      <w:bookmarkEnd w:id="5"/>
     </w:p>
-    <w:bookmarkEnd w:id="1"/>
+    <w:bookmarkEnd w:id="2"/>
     <w:p>
       <w:pPr>
         <w:jc w:val="both"/>
@@ -1418,10 +1413,10 @@
           <w:lang w:val="es-CO" w:eastAsia="en-US"/>
         </w:rPr>
       </w:pPr>
-      <w:bookmarkStart w:id="5" w:name="_Hlk170132818"/>
-      <w:bookmarkStart w:id="6" w:name="_Hlk106184349"/>
-      <w:bookmarkEnd w:id="2"/>
+      <w:bookmarkStart w:id="6" w:name="_Hlk170132818"/>
+      <w:bookmarkStart w:id="7" w:name="_Hlk106184349"/>
       <w:bookmarkEnd w:id="3"/>
+      <w:bookmarkEnd w:id="4"/>
       <w:r>
         <w:rPr>
           <w:rFonts w:ascii="Arial" w:eastAsia="Calibri" w:hAnsi="Arial" w:cs="Arial"/>
@@ -1444,8 +1439,9 @@
           <w:bCs/>
           <w:lang w:val="es-CO" w:eastAsia="en-US"/>
         </w:rPr>
-        <w:fldChar w:fldCharType="begin"/>
-      </w:r>
+        <w:t>{{</w:t>
+      </w:r>
+      <w:proofErr w:type="spellStart"/>
       <w:r>
         <w:rPr>
           <w:rFonts w:ascii="Arial" w:eastAsia="Calibri" w:hAnsi="Arial" w:cs="Arial"/>
@@ -1453,15 +1449,9 @@
           <w:bCs/>
           <w:lang w:val="es-CO" w:eastAsia="en-US"/>
         </w:rPr>
-        <w:instrText xml:space="preserve"> MERGEFIELD nombre_radicado </w:instrText>
-      </w:r>
-      <w:r>
-        <w:rPr>
-          <w:rFonts w:ascii="Arial" w:eastAsia="Calibri" w:hAnsi="Arial" w:cs="Arial"/>
-          <w:lang w:val="es-CO" w:eastAsia="en-US"/>
-        </w:rPr>
-        <w:instrText>\* Upper</w:instrText>
-      </w:r>
+        <w:t>nombre_radicado</w:t>
+      </w:r>
+      <w:proofErr w:type="spellEnd"/>
       <w:r>
         <w:rPr>
           <w:rFonts w:ascii="Arial" w:eastAsia="Calibri" w:hAnsi="Arial" w:cs="Arial"/>
@@ -1469,44 +1459,14 @@
           <w:bCs/>
           <w:lang w:val="es-CO" w:eastAsia="en-US"/>
         </w:rPr>
-        <w:fldChar w:fldCharType="separate"/>
-      </w:r>
-      <w:r>
-        <w:rPr>
-          <w:rFonts w:ascii="Arial" w:eastAsia="Calibri" w:hAnsi="Arial" w:cs="Arial"/>
-          <w:b/>
-          <w:bCs/>
-          <w:noProof/>
-          <w:lang w:val="es-CO" w:eastAsia="en-US"/>
-        </w:rPr>
-        <w:t>{{nombre_radicado</w:t>
-      </w:r>
-      <w:r>
-        <w:rPr>
-          <w:rFonts w:ascii="Arial" w:eastAsia="Calibri" w:hAnsi="Arial" w:cs="Arial"/>
-          <w:b/>
-          <w:bCs/>
-          <w:lang w:val="es-CO" w:eastAsia="en-US"/>
-        </w:rPr>
-        <w:fldChar w:fldCharType="end"/>
-      </w:r>
-      <w:r>
-        <w:rPr>
-          <w:rFonts w:ascii="Arial" w:eastAsia="Calibri" w:hAnsi="Arial" w:cs="Arial"/>
-          <w:b/>
-          <w:bCs/>
-          <w:lang w:val="es-CO" w:eastAsia="en-US"/>
-        </w:rPr>
-        <w:t>}}</w:t>
-      </w:r>
-      <w:bookmarkStart w:id="7" w:name="_GoBack"/>
-      <w:bookmarkEnd w:id="7"/>
-      <w:r>
-        <w:rPr>
-          <w:rFonts w:ascii="Arial" w:eastAsia="Calibri" w:hAnsi="Arial" w:cs="Arial"/>
-          <w:lang w:val="es-CO" w:eastAsia="en-US"/>
-        </w:rPr>
-        <w:t xml:space="preserve"> al correo electrónico </w:t>
+        <w:t xml:space="preserve">}} </w:t>
+      </w:r>
+      <w:r>
+        <w:rPr>
+          <w:rFonts w:ascii="Arial" w:eastAsia="Calibri" w:hAnsi="Arial" w:cs="Arial"/>
+          <w:lang w:val="es-CO" w:eastAsia="en-US"/>
+        </w:rPr>
+        <w:t xml:space="preserve">al correo electrónico </w:t>
       </w:r>
       <w:r>
         <w:rPr>
@@ -2049,8 +2009,8 @@
         </w:rPr>
         <w:t xml:space="preserve"> . En caso de no surtirse la notificación personal, procédase a la notificación por aviso, de conformidad con lo dispuesto en el artículo 69 de la Ley 1437 de 2011.</w:t>
       </w:r>
-      <w:bookmarkEnd w:id="5"/>
       <w:bookmarkEnd w:id="6"/>
+      <w:bookmarkEnd w:id="7"/>
     </w:p>
     <w:p>
       <w:pPr>
@@ -2888,21 +2848,21 @@
         <v:path o:extrusionok="f" gradientshapeok="t" o:connecttype="rect"/>
         <o:lock v:ext="edit" aspectratio="t"/>
       </v:shapetype>
-      <v:shape id="_x0000_i1043" type="#_x0000_t75" style="width:12.75pt;height:12.75pt" o:bullet="t">
+      <v:shape id="_x0000_i1029" type="#_x0000_t75" style="width:12.75pt;height:12.75pt" o:bullet="t">
         <v:imagedata r:id="rId1" o:title="mso2D3D"/>
       </v:shape>
     </w:pict>
   </w:numPicBullet>
   <w:numPicBullet w:numPicBulletId="1">
     <w:pict>
-      <v:shape id="_x0000_i1044" type="#_x0000_t75" style="width:12.75pt;height:12.75pt" o:bullet="t">
+      <v:shape id="_x0000_i1030" type="#_x0000_t75" style="width:12.75pt;height:12.75pt" o:bullet="t">
         <v:imagedata r:id="rId2" o:title="msoCA65"/>
       </v:shape>
     </w:pict>
   </w:numPicBullet>
   <w:numPicBullet w:numPicBulletId="2">
     <w:pict>
-      <v:shape id="_x0000_i1045" type="#_x0000_t75" style="width:69pt;height:54pt" o:bullet="t">
+      <v:shape id="_x0000_i1031" type="#_x0000_t75" style="width:69pt;height:54pt" o:bullet="t">
         <v:imagedata r:id="rId3" o:title="clip_image002"/>
       </v:shape>
     </w:pict>
@@ -9494,7 +9454,7 @@
 </file>
 
 <file path=customXml/itemProps1.xml><?xml version="1.0" encoding="utf-8"?>
-<ds:datastoreItem xmlns:ds="http://schemas.openxmlformats.org/officeDocument/2006/customXml" ds:itemID="{147E18D3-8BFF-4652-90EB-3725BA44E77A}">
+<ds:datastoreItem xmlns:ds="http://schemas.openxmlformats.org/officeDocument/2006/customXml" ds:itemID="{B4A6657C-F649-461A-A75E-FE9EB628DC0D}">
   <ds:schemaRefs>
     <ds:schemaRef ds:uri="http://schemas.openxmlformats.org/officeDocument/2006/bibliography"/>
   </ds:schemaRefs>

</xml_diff>